<commit_message>
fix: corrige observaciones de feedback final
</commit_message>
<xml_diff>
--- a/docs/das/GRY2203_EFT_S9_Grupo7_DAS.docx
+++ b/docs/das/GRY2203_EFT_S9_Grupo7_DAS.docx
@@ -737,6 +737,9 @@
               </w:rPr>
               <w:t xml:space="preserve">: </w:t>
             </w:r>
+            <w:r>
+              <w:t>8 de octubre de 2026</w:t>
+            </w:r>
           </w:p>
         </w:tc>
       </w:tr>
@@ -30092,21 +30095,8 @@
         </w:rPr>
       </w:pPr>
       <w:r>
-        <w:rPr>
-          <w:lang w:val="es-ES_tradnl"/>
-        </w:rPr>
-        <w:t xml:space="preserve">La versión de alta fidelidad se trabajó en Adobe XD y se complementó con un prototipo web construido con HTML5, CSS, Bootstrap 5.3.8 y JavaScript. Esta combinación permitió disponer de una representación visual detallada y, al mismo tiempo, de una versión navegable en navegador capaz de simular cambios de pantalla, formularios, menús y comportamiento responsive. Prototipo publicado: </w:t>
+        <w:t>La versión de alta fidelidad se construyó como un prototipo web con HTML5, CSS, Bootstrap 5.3.8 y JavaScript. Esta implementación permitió disponer de una representación visual detallada y navegable en navegador, capaz de simular cambios de pantalla, formularios, menús diferenciados por rol y comportamiento responsive. El archivo HTML forma parte de los artefactos de la entrega.</w:t>
       </w:r>
-      <w:hyperlink r:id="rId28">
-        <w:r>
-          <w:rPr>
-            <w:color w:val="0563C1"/>
-            <w:u w:val="single"/>
-            <w:lang w:val="es-ES_tradnl"/>
-          </w:rPr>
-          <w:t>https://xd.adobe.com/view/aba24512-c1cb-4a5e-8f3e-6a824c4666ce-fef1/</w:t>
-        </w:r>
-      </w:hyperlink>
     </w:p>
     <w:p>
       <w:pPr>
@@ -31412,24 +31402,7 @@
         </w:rPr>
       </w:pPr>
       <w:r>
-        <w:rPr>
-          <w:lang w:val="es-ES_tradnl"/>
-        </w:rPr>
-        <w:t xml:space="preserve">En accesibilidad se aplicaron los principios POUR: contenido perceptible, controles operables, mensajes comprensibles y una estructura robusta. Se utilizaron contrastes visuales adecuados, tamaños de texto legibles, etiquetas en formularios, iconos acompañados de texto y adaptación responsive. En dispositivos móviles, las tablas se presentan dentro de contenedores responsivos y la navegación lateral se transforma en un menú </w:t>
-      </w:r>
-      <w:proofErr w:type="spellStart"/>
-      <w:r>
-        <w:rPr>
-          <w:lang w:val="es-ES_tradnl"/>
-        </w:rPr>
-        <w:t>offcanvas</w:t>
-      </w:r>
-      <w:proofErr w:type="spellEnd"/>
-      <w:r>
-        <w:rPr>
-          <w:lang w:val="es-ES_tradnl"/>
-        </w:rPr>
-        <w:t xml:space="preserve"> para evitar cortes de contenido.</w:t>
+        <w:t>En accesibilidad se aplicaron los principios POUR: contenido perceptible, controles operables, mensajes comprensibles y una estructura robusta. Se utilizaron contrastes visuales adecuados, tamaños de texto legibles, etiquetas en formularios, iconos acompañados de texto y adaptación responsive. En dispositivos móviles, las tablas se presentan dentro de contenedores responsivos y la navegación lateral se transforma en un menú offcanvas para evitar cortes de contenido. El prototipo toma como referencia WCAG 2.1 nivel AA para orientar estas decisiones; no se declara conformidad completa sin una auditoría formal de accesibilidad.</w:t>
       </w:r>
     </w:p>
     <w:p>
@@ -32001,104 +31974,6 @@
                 <w:lang w:val="es-ES_tradnl"/>
               </w:rPr>
               <w:t>Permitió simular navegación, cambios de pantalla e interacciones sin implementar lógica de negocio real.</w:t>
-            </w:r>
-          </w:p>
-        </w:tc>
-      </w:tr>
-      <w:tr>
-        <w:trPr>
-          <w:cantSplit/>
-          <w:jc w:val="center"/>
-        </w:trPr>
-        <w:tc>
-          <w:tcPr>
-            <w:tcW w:w="1667" w:type="pct"/>
-            <w:tcMar>
-              <w:top w:w="80" w:type="dxa"/>
-              <w:left w:w="100" w:type="dxa"/>
-              <w:bottom w:w="80" w:type="dxa"/>
-              <w:right w:w="100" w:type="dxa"/>
-            </w:tcMar>
-            <w:vAlign w:val="center"/>
-          </w:tcPr>
-          <w:p>
-            <w:pPr>
-              <w:spacing w:line="360" w:lineRule="auto"/>
-              <w:rPr>
-                <w:lang w:val="es-ES_tradnl"/>
-              </w:rPr>
-            </w:pPr>
-            <w:r>
-              <w:rPr>
-                <w:lang w:val="es-ES_tradnl"/>
-              </w:rPr>
-              <w:t>Adobe XD</w:t>
-            </w:r>
-          </w:p>
-        </w:tc>
-        <w:tc>
-          <w:tcPr>
-            <w:tcW w:w="1667" w:type="pct"/>
-            <w:tcMar>
-              <w:top w:w="80" w:type="dxa"/>
-              <w:left w:w="100" w:type="dxa"/>
-              <w:bottom w:w="80" w:type="dxa"/>
-              <w:right w:w="100" w:type="dxa"/>
-            </w:tcMar>
-            <w:vAlign w:val="center"/>
-          </w:tcPr>
-          <w:p>
-            <w:pPr>
-              <w:spacing w:line="360" w:lineRule="auto"/>
-              <w:rPr>
-                <w:lang w:val="es-ES_tradnl"/>
-              </w:rPr>
-            </w:pPr>
-            <w:r>
-              <w:rPr>
-                <w:lang w:val="es-ES_tradnl"/>
-              </w:rPr>
-              <w:t>Alta fidelidad</w:t>
-            </w:r>
-          </w:p>
-        </w:tc>
-        <w:tc>
-          <w:tcPr>
-            <w:tcW w:w="1667" w:type="pct"/>
-            <w:tcMar>
-              <w:top w:w="80" w:type="dxa"/>
-              <w:left w:w="100" w:type="dxa"/>
-              <w:bottom w:w="80" w:type="dxa"/>
-              <w:right w:w="100" w:type="dxa"/>
-            </w:tcMar>
-            <w:vAlign w:val="center"/>
-          </w:tcPr>
-          <w:p>
-            <w:pPr>
-              <w:spacing w:line="360" w:lineRule="auto"/>
-              <w:rPr>
-                <w:lang w:val="es-ES_tradnl"/>
-              </w:rPr>
-            </w:pPr>
-            <w:r>
-              <w:rPr>
-                <w:lang w:val="es-ES_tradnl"/>
-              </w:rPr>
-              <w:t xml:space="preserve">Se utilizó para definir el sistema visual, componentes, </w:t>
-            </w:r>
-            <w:proofErr w:type="spellStart"/>
-            <w:r>
-              <w:rPr>
-                <w:lang w:val="es-ES_tradnl"/>
-              </w:rPr>
-              <w:t>artboards</w:t>
-            </w:r>
-            <w:proofErr w:type="spellEnd"/>
-            <w:r>
-              <w:rPr>
-                <w:lang w:val="es-ES_tradnl"/>
-              </w:rPr>
-              <w:t>, flujos e interacciones del prototipo de alta fidelidad.</w:t>
             </w:r>
           </w:p>
         </w:tc>

</xml_diff>